<commit_message>
fix(skpi): kembalikan logo Kop Surat resmi dari gambar background dan bersihkan teks header duplikat
</commit_message>
<xml_diff>
--- a/public/TEMPLATE SKPI USH ver.2003 (2).docx
+++ b/public/TEMPLATE SKPI USH ver.2003 (2).docx
@@ -11052,6 +11052,87 @@
         <w:szCs w:val="28"/>
       </w:rPr>
       <w:t xml:space="preserve"> Hartono University</w:t>
+    </w:r>
+  </w:p>
+</w:hdr>
+</file>
+
+<file path=word/header2.xml><?xml version="1.0" encoding="utf-8"?>
+<w:hdr xmlns:wpc="http://schemas.microsoft.com/office/word/2010/wordprocessingCanvas" xmlns:cx="http://schemas.microsoft.com/office/drawing/2014/chartex" xmlns:cx1="http://schemas.microsoft.com/office/drawing/2015/9/8/chartex" xmlns:cx2="http://schemas.microsoft.com/office/drawing/2015/10/21/chartex" xmlns:cx3="http://schemas.microsoft.com/office/drawing/2016/5/9/chartex" xmlns:cx4="http://schemas.microsoft.com/office/drawing/2016/5/10/chartex" xmlns:cx5="http://schemas.microsoft.com/office/drawing/2016/5/11/chartex" xmlns:cx6="http://schemas.microsoft.com/office/drawing/2016/5/12/chartex" xmlns:cx7="http://schemas.microsoft.com/office/drawing/2016/5/13/chartex" xmlns:cx8="http://schemas.microsoft.com/office/drawing/2016/5/14/chartex" xmlns:mc="http://schemas.openxmlformats.org/markup-compatibility/2006" xmlns:aink="http://schemas.microsoft.com/office/drawing/2016/ink" xmlns:am3d="http://schemas.microsoft.com/office/drawing/2017/model3d" xmlns:o="urn:schemas-microsoft-com:office:office" xmlns:oel="http://schemas.microsoft.com/office/2019/extlst" xmlns:r="http://schemas.openxmlformats.org/officeDocument/2006/relationships" xmlns:m="http://schemas.openxmlformats.org/officeDocument/2006/math" xmlns:v="urn:schemas-microsoft-com:vml" xmlns:wp14="http://schemas.microsoft.com/office/word/2010/wordprocessingDrawing" xmlns:wp="http://schemas.openxmlformats.org/drawingml/2006/wordprocessingDrawing" xmlns:w10="urn:schemas-microsoft-com:office:word" xmlns:w="http://schemas.openxmlformats.org/wordprocessingml/2006/main" xmlns:w14="http://schemas.microsoft.com/office/word/2010/wordml" xmlns:w15="http://schemas.microsoft.com/office/word/2012/wordml" xmlns:w16cex="http://schemas.microsoft.com/office/word/2018/wordml/cex" xmlns:w16cid="http://schemas.microsoft.com/office/word/2016/wordml/cid" xmlns:w16="http://schemas.microsoft.com/office/word/2018/wordml" xmlns:w16sdtdh="http://schemas.microsoft.com/office/word/2020/wordml/sdtdatahash" xmlns:w16se="http://schemas.microsoft.com/office/word/2015/wordml/symex" xmlns:wpg="http://schemas.microsoft.com/office/word/2010/wordprocessingGroup" xmlns:wpi="http://schemas.microsoft.com/office/word/2010/wordprocessingInk" xmlns:wne="http://schemas.microsoft.com/office/word/2006/wordml" xmlns:wps="http://schemas.microsoft.com/office/word/2010/wordprocessingShape" mc:Ignorable="w14 w15 w16se w16cid w16 w16cex w16sdtdh wp14">
+  <w:p>
+    <w:pPr>
+      <w:ind w:right="4"/>
+      <w:jc w:val="center"/>
+      <w:rPr>
+        <w:b/>
+        <w:bCs/>
+        <w:sz w:val="36"/>
+        <w:szCs w:val="36"/>
+      </w:rPr>
+    </w:pPr>
+    <w:r>
+      <w:rPr>
+        <w:b/>
+        <w:bCs/>
+        <w:noProof/>
+        <w:sz w:val="36"/>
+        <w:szCs w:val="36"/>
+      </w:rPr>
+      <w:drawing>
+        <wp:anchor distT="0" distB="0" distL="114300" distR="114300" simplePos="0" relativeHeight="251659264" behindDoc="1" locked="0" layoutInCell="1" allowOverlap="1" wp14:anchorId="6FA86C1C" wp14:editId="234AEE24">
+          <wp:simplePos x="0" y="0"/>
+          <wp:positionH relativeFrom="column">
+            <wp:posOffset>-914213</wp:posOffset>
+          </wp:positionH>
+          <wp:positionV relativeFrom="paragraph">
+            <wp:posOffset>-213995</wp:posOffset>
+          </wp:positionV>
+          <wp:extent cx="7743825" cy="11886217"/>
+          <wp:effectExtent l="0" t="0" r="0" b="1270"/>
+          <wp:wrapNone/>
+          <wp:docPr id="1046271608" name="Picture 2"/>
+          <wp:cNvGraphicFramePr>
+            <a:graphicFrameLocks xmlns:a="http://schemas.openxmlformats.org/drawingml/2006/main" noChangeAspect="1"/>
+          </wp:cNvGraphicFramePr>
+          <a:graphic xmlns:a="http://schemas.openxmlformats.org/drawingml/2006/main">
+            <a:graphicData uri="http://schemas.openxmlformats.org/drawingml/2006/picture">
+              <pic:pic xmlns:pic="http://schemas.openxmlformats.org/drawingml/2006/picture">
+                <pic:nvPicPr>
+                  <pic:cNvPr id="1046271608" name="Picture 1046271608"/>
+                  <pic:cNvPicPr/>
+                </pic:nvPicPr>
+                <pic:blipFill>
+                  <a:blip r:embed="rId1">
+                    <a:extLst>
+                      <a:ext uri="{28A0092B-C50C-407E-A947-70E740481C1C}">
+                        <a14:useLocalDpi xmlns:a14="http://schemas.microsoft.com/office/drawing/2010/main" val="0"/>
+                      </a:ext>
+                    </a:extLst>
+                  </a:blip>
+                  <a:stretch>
+                    <a:fillRect/>
+                  </a:stretch>
+                </pic:blipFill>
+                <pic:spPr>
+                  <a:xfrm>
+                    <a:off x="0" y="0"/>
+                    <a:ext cx="7743825" cy="11886217"/>
+                  </a:xfrm>
+                  <a:prstGeom prst="rect">
+                    <a:avLst/>
+                  </a:prstGeom>
+                </pic:spPr>
+              </pic:pic>
+            </a:graphicData>
+          </a:graphic>
+          <wp14:sizeRelH relativeFrom="margin">
+            <wp14:pctWidth>0</wp14:pctWidth>
+          </wp14:sizeRelH>
+          <wp14:sizeRelV relativeFrom="margin">
+            <wp14:pctHeight>0</wp14:pctHeight>
+          </wp14:sizeRelV>
+        </wp:anchor>
+      </w:drawing>
     </w:r>
   </w:p>
 </w:hdr>

</xml_diff>